<commit_message>
MidCourse report: latest edits
</commit_message>
<xml_diff>
--- a/DocumentsAndReports/JaismineK_MidCourseProgressReport.docx
+++ b/DocumentsAndReports/JaismineK_MidCourseProgressReport.docx
@@ -1290,6 +1290,9 @@
     </w:p>
     <w:p>
       <w:r>
+        <w:rPr>
+          <w:noProof/>
+        </w:rPr>
         <w:drawing>
           <wp:inline distT="0" distB="0" distL="0" distR="0" wp14:anchorId="356D22A0" wp14:editId="246028E8">
             <wp:extent cx="5486400" cy="2719070"/>
@@ -1329,6 +1332,9 @@
     </w:p>
     <w:p>
       <w:r>
+        <w:rPr>
+          <w:noProof/>
+        </w:rPr>
         <w:lastRenderedPageBreak/>
         <w:drawing>
           <wp:inline distT="0" distB="0" distL="0" distR="0" wp14:anchorId="4E2E507D" wp14:editId="129ADB4A">
@@ -1369,6 +1375,9 @@
     </w:p>
     <w:p>
       <w:r>
+        <w:rPr>
+          <w:noProof/>
+        </w:rPr>
         <w:drawing>
           <wp:inline distT="0" distB="0" distL="0" distR="0" wp14:anchorId="6C366593" wp14:editId="0D8BF349">
             <wp:extent cx="5486400" cy="2710180"/>
@@ -1408,6 +1417,9 @@
     </w:p>
     <w:p>
       <w:r>
+        <w:rPr>
+          <w:noProof/>
+        </w:rPr>
         <w:lastRenderedPageBreak/>
         <w:drawing>
           <wp:inline distT="0" distB="0" distL="0" distR="0" wp14:anchorId="09FC5E29" wp14:editId="25BA23CC">
@@ -1475,6 +1487,7 @@
       <w:r>
         <w:rPr>
           <w:i/>
+          <w:noProof/>
           <w:color w:val="808080"/>
         </w:rPr>
         <w:drawing>
@@ -1524,6 +1537,7 @@
       <w:r>
         <w:rPr>
           <w:i/>
+          <w:noProof/>
           <w:color w:val="808080"/>
         </w:rPr>
         <w:lastRenderedPageBreak/>
@@ -1574,6 +1588,9 @@
     </w:p>
     <w:p>
       <w:r>
+        <w:rPr>
+          <w:noProof/>
+        </w:rPr>
         <w:drawing>
           <wp:inline distT="0" distB="0" distL="0" distR="0" wp14:anchorId="304BECC9" wp14:editId="5394A572">
             <wp:extent cx="5486400" cy="2690495"/>
@@ -1613,6 +1630,9 @@
     </w:p>
     <w:p>
       <w:r>
+        <w:rPr>
+          <w:noProof/>
+        </w:rPr>
         <w:lastRenderedPageBreak/>
         <w:drawing>
           <wp:inline distT="0" distB="0" distL="0" distR="0" wp14:anchorId="0E044649" wp14:editId="55C8C580">
@@ -1670,23 +1690,10 @@
       </w:r>
     </w:p>
     <w:p>
-      <w:pPr>
-        <w:rPr>
-          <w:i/>
-          <w:color w:val="808080"/>
-        </w:rPr>
-      </w:pPr>
       <w:r>
         <w:rPr>
-          <w:i/>
-          <w:color w:val="808080"/>
+          <w:noProof/>
         </w:rPr>
-        <w:t>Cleaning log</w:t>
-      </w:r>
-    </w:p>
-    <w:p>
-      <w:r>
-        <w:lastRenderedPageBreak/>
         <w:drawing>
           <wp:inline distT="0" distB="0" distL="0" distR="0" wp14:anchorId="1F7AE89E" wp14:editId="6CDA8B6A">
             <wp:extent cx="5486400" cy="3478530"/>
@@ -1728,12 +1735,9 @@
     <w:p/>
     <w:p>
       <w:r>
-        <w:t>Data quality summary files</w:t>
-      </w:r>
-    </w:p>
-    <w:p>
-      <w:r>
-        <w:lastRenderedPageBreak/>
+        <w:rPr>
+          <w:noProof/>
+        </w:rPr>
         <w:drawing>
           <wp:inline distT="0" distB="0" distL="0" distR="0" wp14:anchorId="513AB5BF" wp14:editId="0BC02B0D">
             <wp:extent cx="5486400" cy="5215890"/>
@@ -1773,6 +1777,9 @@
     </w:p>
     <w:p>
       <w:r>
+        <w:rPr>
+          <w:noProof/>
+        </w:rPr>
         <w:lastRenderedPageBreak/>
         <w:drawing>
           <wp:inline distT="0" distB="0" distL="0" distR="0" wp14:anchorId="6D1F66AE" wp14:editId="2CB27307">
@@ -1813,6 +1820,9 @@
     </w:p>
     <w:p>
       <w:r>
+        <w:rPr>
+          <w:noProof/>
+        </w:rPr>
         <w:lastRenderedPageBreak/>
         <w:drawing>
           <wp:inline distT="0" distB="0" distL="0" distR="0" wp14:anchorId="1645CDCB" wp14:editId="0EF49BF9">
@@ -1871,6 +1881,9 @@
     </w:p>
     <w:p>
       <w:r>
+        <w:rPr>
+          <w:noProof/>
+        </w:rPr>
         <w:lastRenderedPageBreak/>
         <w:drawing>
           <wp:inline distT="0" distB="0" distL="0" distR="0" wp14:anchorId="374B6C42" wp14:editId="3CEC0FD4">
@@ -1911,6 +1924,9 @@
     </w:p>
     <w:p>
       <w:r>
+        <w:rPr>
+          <w:noProof/>
+        </w:rPr>
         <w:drawing>
           <wp:inline distT="0" distB="0" distL="0" distR="0" wp14:anchorId="1A060F5D" wp14:editId="6F96AF59">
             <wp:extent cx="5486400" cy="2686050"/>
@@ -1950,6 +1966,9 @@
     </w:p>
     <w:p>
       <w:r>
+        <w:rPr>
+          <w:noProof/>
+        </w:rPr>
         <w:lastRenderedPageBreak/>
         <w:drawing>
           <wp:inline distT="0" distB="0" distL="0" distR="0" wp14:anchorId="25511AB0" wp14:editId="710D901C">
@@ -1990,6 +2009,9 @@
     </w:p>
     <w:p>
       <w:r>
+        <w:rPr>
+          <w:noProof/>
+        </w:rPr>
         <w:drawing>
           <wp:inline distT="0" distB="0" distL="0" distR="0" wp14:anchorId="58ED3670" wp14:editId="1A6F9432">
             <wp:extent cx="5486400" cy="2697480"/>
@@ -2030,6 +2052,9 @@
     <w:p/>
     <w:p>
       <w:r>
+        <w:rPr>
+          <w:noProof/>
+        </w:rPr>
         <w:lastRenderedPageBreak/>
         <w:drawing>
           <wp:inline distT="0" distB="0" distL="0" distR="0" wp14:anchorId="421BEB3E" wp14:editId="58EDB6D3">
@@ -2070,6 +2095,9 @@
     </w:p>
     <w:p>
       <w:r>
+        <w:rPr>
+          <w:noProof/>
+        </w:rPr>
         <w:drawing>
           <wp:inline distT="0" distB="0" distL="0" distR="0" wp14:anchorId="2251858B" wp14:editId="1FFF33CD">
             <wp:extent cx="5486400" cy="2707640"/>
@@ -2109,6 +2137,9 @@
     </w:p>
     <w:p>
       <w:r>
+        <w:rPr>
+          <w:noProof/>
+        </w:rPr>
         <w:lastRenderedPageBreak/>
         <w:drawing>
           <wp:inline distT="0" distB="0" distL="0" distR="0" wp14:anchorId="71CC6913" wp14:editId="07BB3800">
@@ -2149,6 +2180,9 @@
     </w:p>
     <w:p>
       <w:r>
+        <w:rPr>
+          <w:noProof/>
+        </w:rPr>
         <w:drawing>
           <wp:inline distT="0" distB="0" distL="0" distR="0" wp14:anchorId="20E86EA7" wp14:editId="15CAFCA9">
             <wp:extent cx="5486400" cy="2694305"/>
@@ -2188,6 +2222,9 @@
     </w:p>
     <w:p>
       <w:r>
+        <w:rPr>
+          <w:noProof/>
+        </w:rPr>
         <w:drawing>
           <wp:inline distT="0" distB="0" distL="0" distR="0" wp14:anchorId="29B16493" wp14:editId="1741194A">
             <wp:extent cx="5486400" cy="1478915"/>
@@ -2227,6 +2264,9 @@
     </w:p>
     <w:p>
       <w:r>
+        <w:rPr>
+          <w:noProof/>
+        </w:rPr>
         <w:lastRenderedPageBreak/>
         <w:drawing>
           <wp:inline distT="0" distB="0" distL="0" distR="0" wp14:anchorId="5CEB3FED" wp14:editId="7D1C0CFD">
@@ -2316,11 +2356,7 @@
     </w:p>
     <w:p>
       <w:r>
-        <w:t xml:space="preserve">What it does: pick a crime type and see the next 12 months predicted with a moving-average model, compared honestly against a "same as last year" baseline. The page shows MAE and </w:t>
-      </w:r>
-      <w:r>
-        <w:lastRenderedPageBreak/>
-        <w:t>RMSE of past predictions so users see how wrong the model can be. Plain-English explainers are included.</w:t>
+        <w:t>What it does: pick a crime type and see the next 12 months predicted with a moving-average model, compared honestly against a "same as last year" baseline. The page shows MAE and RMSE of past predictions so users see how wrong the model can be. Plain-English explainers are included.</w:t>
       </w:r>
     </w:p>
     <w:p>
@@ -2338,6 +2374,7 @@
     </w:p>
     <w:p>
       <w:r>
+        <w:lastRenderedPageBreak/>
         <w:t>What it does: threat model v0.4 with assets, threat actors, STRIDE analysis, OWASP Top 10 mapping, a controls table with implemented statuses, and a security testing plan. Privacy review v0.1 covers data inventory, privacy principles, credential handling, and location-data handling. The documents stay in sync with the code: when a control gets implemented, the status is updated.</w:t>
       </w:r>
     </w:p>
@@ -3172,7 +3209,6 @@
     </w:tbl>
     <w:p>
       <w:r>
-        <w:lastRenderedPageBreak/>
         <w:br w:type="page"/>
       </w:r>
     </w:p>
@@ -4520,7 +4556,6 @@
           </w:tcPr>
           <w:p>
             <w:r>
-              <w:lastRenderedPageBreak/>
               <w:t>Oct 11, 2026</w:t>
             </w:r>
           </w:p>
@@ -4945,7 +4980,6 @@
           </w:tcPr>
           <w:p>
             <w:r>
-              <w:lastRenderedPageBreak/>
               <w:t>Oct 16, 2026</w:t>
             </w:r>
           </w:p>
@@ -5265,7 +5299,6 @@
           </w:tcPr>
           <w:p>
             <w:r>
-              <w:lastRenderedPageBreak/>
               <w:t>Oct 22, 2026</w:t>
             </w:r>
           </w:p>
@@ -5841,21 +5874,7 @@
         <w:rPr>
           <w:lang w:val="fr-FR"/>
         </w:rPr>
-        <w:t xml:space="preserve">[9] SciPy Documentation. </w:t>
-      </w:r>
-      <w:proofErr w:type="gramStart"/>
-      <w:r>
-        <w:rPr>
-          <w:lang w:val="fr-FR"/>
-        </w:rPr>
-        <w:t>scipy.stats</w:t>
-      </w:r>
-      <w:proofErr w:type="gramEnd"/>
-      <w:r>
-        <w:rPr>
-          <w:lang w:val="fr-FR"/>
-        </w:rPr>
-        <w:t>.chi2_contingency. https://docs.scipy.org/</w:t>
+        <w:t>[9] SciPy Documentation. scipy.stats.chi2_contingency. https://docs.scipy.org/</w:t>
       </w:r>
     </w:p>
     <w:p>

</xml_diff>

<commit_message>
MidCourse report: add video demo link to title page
</commit_message>
<xml_diff>
--- a/DocumentsAndReports/JaismineK_MidCourseProgressReport.docx
+++ b/DocumentsAndReports/JaismineK_MidCourseProgressReport.docx
@@ -33,12 +33,21 @@
       <w:pPr>
         <w:jc w:val="center"/>
       </w:pPr>
+      <w:proofErr w:type="spellStart"/>
       <w:r>
         <w:rPr>
           <w:b/>
           <w:sz w:val="32"/>
         </w:rPr>
-        <w:t>MidCourse Progress Report</w:t>
+        <w:t>MidCourse</w:t>
+      </w:r>
+      <w:proofErr w:type="spellEnd"/>
+      <w:r>
+        <w:rPr>
+          <w:b/>
+          <w:sz w:val="32"/>
+        </w:rPr>
+        <w:t xml:space="preserve"> Progress Report</w:t>
       </w:r>
     </w:p>
     <w:p/>
@@ -98,8 +107,21 @@
           </w:tcPr>
           <w:p>
             <w:r>
-              <w:t>Padmapriya Arasanipalai Kandhadai</w:t>
-            </w:r>
+              <w:t xml:space="preserve">Padmapriya </w:t>
+            </w:r>
+            <w:proofErr w:type="spellStart"/>
+            <w:r>
+              <w:t>Arasanipalai</w:t>
+            </w:r>
+            <w:proofErr w:type="spellEnd"/>
+            <w:r>
+              <w:t xml:space="preserve"> </w:t>
+            </w:r>
+            <w:proofErr w:type="spellStart"/>
+            <w:r>
+              <w:t>Kandhadai</w:t>
+            </w:r>
+            <w:proofErr w:type="spellEnd"/>
           </w:p>
         </w:tc>
       </w:tr>
@@ -122,8 +144,13 @@
             <w:tcW w:w="4320" w:type="dxa"/>
           </w:tcPr>
           <w:p>
-            <w:r>
-              <w:t>Jaismine Kaur (responsible for all joint submissions)</w:t>
+            <w:proofErr w:type="spellStart"/>
+            <w:r>
+              <w:t>Jaismine</w:t>
+            </w:r>
+            <w:proofErr w:type="spellEnd"/>
+            <w:r>
+              <w:t xml:space="preserve"> Kaur (responsible for all joint submissions)</w:t>
             </w:r>
           </w:p>
         </w:tc>
@@ -147,8 +174,13 @@
             <w:tcW w:w="4320" w:type="dxa"/>
           </w:tcPr>
           <w:p>
-            <w:r>
-              <w:t>Jaismine Kaur (300415820) - Data Analytics</w:t>
+            <w:proofErr w:type="spellStart"/>
+            <w:r>
+              <w:t>Jaismine</w:t>
+            </w:r>
+            <w:proofErr w:type="spellEnd"/>
+            <w:r>
+              <w:t xml:space="preserve"> Kaur (300415820) - Data Analytics</w:t>
             </w:r>
           </w:p>
         </w:tc>
@@ -209,19 +241,50 @@
       <w:pPr>
         <w:jc w:val="center"/>
       </w:pPr>
+      <w:proofErr w:type="spellStart"/>
       <w:r>
         <w:rPr>
           <w:b/>
         </w:rPr>
-        <w:t>MidCourse Progress Video Demonstration (link):</w:t>
+        <w:t>MidCourse</w:t>
+      </w:r>
+      <w:proofErr w:type="spellEnd"/>
+      <w:r>
+        <w:rPr>
+          <w:b/>
+        </w:rPr>
+        <w:t xml:space="preserve"> Progress Video Demonstration (link):</w:t>
       </w:r>
     </w:p>
     <w:p>
       <w:pPr>
-        <w:jc w:val="center"/>
+        <w:rPr>
+          <w:lang w:val="en-CA"/>
+        </w:rPr>
       </w:pPr>
       <w:r>
-        <w:t>VIDEO LINK: []</w:t>
+        <w:t xml:space="preserve">               </w:t>
+      </w:r>
+      <w:r>
+        <w:t xml:space="preserve">                               </w:t>
+      </w:r>
+      <w:r>
+        <w:t xml:space="preserve">  </w:t>
+      </w:r>
+      <w:r>
+        <w:t>VIDEO LINK: [</w:t>
+      </w:r>
+      <w:hyperlink r:id="rId6" w:history="1">
+        <w:r>
+          <w:rPr>
+            <w:rStyle w:val="Hyperlink"/>
+            <w:lang w:val="en-CA"/>
+          </w:rPr>
+          <w:t>midterm Project 1.mp4</w:t>
+        </w:r>
+      </w:hyperlink>
+      <w:r>
+        <w:t>]</w:t>
       </w:r>
     </w:p>
     <w:p>
@@ -253,12 +316,32 @@
     </w:p>
     <w:p>
       <w:r>
-        <w:t>[ ] Video Demo of the Product: One joint video (at least 6 minutes, one video per team) showing a demo of all features. Each team member presents and demos the work they completed. Uploaded to a publicly viewable link, and the link is on the title page of this report.</w:t>
+        <w:t>[</w:t>
+      </w:r>
+      <w:r>
+        <w:t>x</w:t>
+      </w:r>
+      <w:r>
+        <w:t xml:space="preserve">] Video Demo of the Product: One joint video (at least 6 minutes, one video per team) showing a demo of all features. Each team member presents and demos the work they </w:t>
+      </w:r>
+      <w:proofErr w:type="gramStart"/>
+      <w:r>
+        <w:t>completed</w:t>
+      </w:r>
+      <w:proofErr w:type="gramEnd"/>
+      <w:r>
+        <w:t>. Uploaded to a publicly viewable link, and the link is on the title page of this report.</w:t>
       </w:r>
     </w:p>
     <w:p>
       <w:r>
-        <w:t>[ ] Video Link: Clickable, public link of the video is provided on the title page.</w:t>
+        <w:t>[</w:t>
+      </w:r>
+      <w:r>
+        <w:t>x</w:t>
+      </w:r>
+      <w:r>
+        <w:t>] Video Link: Clickable, public link of the video is provided on the title page.</w:t>
       </w:r>
     </w:p>
     <w:p>
@@ -280,7 +363,15 @@
         <w:t>x</w:t>
       </w:r>
       <w:r>
-        <w:t>] MidCourse Progress Report Blackboard Submission: Report submitted on Blackboard by the Team Lead.</w:t>
+        <w:t xml:space="preserve">] </w:t>
+      </w:r>
+      <w:proofErr w:type="spellStart"/>
+      <w:r>
+        <w:t>MidCourse</w:t>
+      </w:r>
+      <w:proofErr w:type="spellEnd"/>
+      <w:r>
+        <w:t xml:space="preserve"> Progress Report Blackboard Submission: Report submitted on Blackboard by the Team Lead.</w:t>
       </w:r>
     </w:p>
     <w:p>
@@ -291,7 +382,23 @@
         <w:t>x</w:t>
       </w:r>
       <w:r>
-        <w:t>] GitHub Repository MidCourse Progress Report Check-in: Report checked into the GitHub repository under DocumentsAndReports.</w:t>
+        <w:t xml:space="preserve">] GitHub Repository </w:t>
+      </w:r>
+      <w:proofErr w:type="spellStart"/>
+      <w:r>
+        <w:t>MidCourse</w:t>
+      </w:r>
+      <w:proofErr w:type="spellEnd"/>
+      <w:r>
+        <w:t xml:space="preserve"> Progress Report Check-in: Report checked into the GitHub repository under </w:t>
+      </w:r>
+      <w:proofErr w:type="spellStart"/>
+      <w:r>
+        <w:t>DocumentsAndReports</w:t>
+      </w:r>
+      <w:proofErr w:type="spellEnd"/>
+      <w:r>
+        <w:t>.</w:t>
       </w:r>
     </w:p>
     <w:p/>
@@ -300,7 +407,21 @@
         <w:rPr>
           <w:b/>
         </w:rPr>
-        <w:t>Note: A MidCourse Progress grade will not be given without the mandatory in-person check-in during class hours. All students must be present.</w:t>
+        <w:t xml:space="preserve">Note: A </w:t>
+      </w:r>
+      <w:proofErr w:type="spellStart"/>
+      <w:r>
+        <w:rPr>
+          <w:b/>
+        </w:rPr>
+        <w:t>MidCourse</w:t>
+      </w:r>
+      <w:proofErr w:type="spellEnd"/>
+      <w:r>
+        <w:rPr>
+          <w:b/>
+        </w:rPr>
+        <w:t xml:space="preserve"> Progress grade will not be given without the mandatory in-person check-in during class hours. All students must be present.</w:t>
       </w:r>
     </w:p>
     <w:p>
@@ -327,7 +448,31 @@
     </w:p>
     <w:p>
       <w:r>
-        <w:t>Crime data tells us a lot about a city, but only if it is easy to understand. The Vancouver Police Department (VPD) publishes its reported crime data on an open data portal called GeoDASH. Anyone can download it. The dataset has around 928,000 rows and covers all 24 neighbourhoods of Vancouver from 2003 up to now. Each row is one reported incident with its crime type, neighbourhood, and approximate location and time.</w:t>
+        <w:t xml:space="preserve">Crime data tells us a lot about a city, but only if it is easy to understand. The Vancouver Police Department (VPD) publishes its reported crime data on an open data portal called </w:t>
+      </w:r>
+      <w:proofErr w:type="spellStart"/>
+      <w:r>
+        <w:t>GeoDASH</w:t>
+      </w:r>
+      <w:proofErr w:type="spellEnd"/>
+      <w:r>
+        <w:t xml:space="preserve">. Anyone can download it. The dataset has around 928,000 rows and covers all 24 </w:t>
+      </w:r>
+      <w:proofErr w:type="spellStart"/>
+      <w:r>
+        <w:t>neighbourhoods</w:t>
+      </w:r>
+      <w:proofErr w:type="spellEnd"/>
+      <w:r>
+        <w:t xml:space="preserve"> of Vancouver from 2003 up to now. Each row is one reported incident with its crime type, </w:t>
+      </w:r>
+      <w:proofErr w:type="spellStart"/>
+      <w:r>
+        <w:t>neighbourhood</w:t>
+      </w:r>
+      <w:proofErr w:type="spellEnd"/>
+      <w:r>
+        <w:t>, and approximate location and time.</w:t>
       </w:r>
     </w:p>
     <w:p>
@@ -366,7 +511,15 @@
         <w:pStyle w:val="ListBullet"/>
       </w:pPr>
       <w:r>
-        <w:t>Which neighbourhoods look similar in their crime mix, and can we group them in a helpful way?</w:t>
+        <w:t xml:space="preserve">Which </w:t>
+      </w:r>
+      <w:proofErr w:type="spellStart"/>
+      <w:r>
+        <w:t>neighbourhoods</w:t>
+      </w:r>
+      <w:proofErr w:type="spellEnd"/>
+      <w:r>
+        <w:t xml:space="preserve"> look similar in their crime mix, and can we group them in a helpful way?</w:t>
       </w:r>
     </w:p>
     <w:p>
@@ -390,7 +543,15 @@
         <w:pStyle w:val="ListBullet"/>
       </w:pPr>
       <w:r>
-        <w:t>How do we let authorized users safely add their own incident records without mixing them into the public data?</w:t>
+        <w:t xml:space="preserve">How do we let authorized users safely add their own incident records without mixing them into </w:t>
+      </w:r>
+      <w:proofErr w:type="gramStart"/>
+      <w:r>
+        <w:t>the public</w:t>
+      </w:r>
+      <w:proofErr w:type="gramEnd"/>
+      <w:r>
+        <w:t xml:space="preserve"> data?</w:t>
       </w:r>
     </w:p>
     <w:p>
@@ -398,7 +559,15 @@
         <w:pStyle w:val="ListBullet"/>
       </w:pPr>
       <w:r>
-        <w:t>What security controls does such a web prototype need, and can we build and test them in real code?</w:t>
+        <w:t xml:space="preserve">What security controls </w:t>
+      </w:r>
+      <w:proofErr w:type="gramStart"/>
+      <w:r>
+        <w:t>does</w:t>
+      </w:r>
+      <w:proofErr w:type="gramEnd"/>
+      <w:r>
+        <w:t xml:space="preserve"> such a web prototype need, and can we build and test them in real code?</w:t>
       </w:r>
     </w:p>
     <w:p>
@@ -448,13 +617,66 @@
       <w:pPr>
         <w:pStyle w:val="ListBullet"/>
       </w:pPr>
-      <w:r>
-        <w:t>Streamlit and open source tools: we studied the official documentation of Streamlit, Folium, pandas and scipy to build the app.</w:t>
+      <w:proofErr w:type="spellStart"/>
+      <w:r>
+        <w:t>Streamlit</w:t>
+      </w:r>
+      <w:proofErr w:type="spellEnd"/>
+      <w:r>
+        <w:t xml:space="preserve"> and </w:t>
+      </w:r>
+      <w:proofErr w:type="gramStart"/>
+      <w:r>
+        <w:t>open source</w:t>
+      </w:r>
+      <w:proofErr w:type="gramEnd"/>
+      <w:r>
+        <w:t xml:space="preserve"> tools: we studied the official documentation of </w:t>
+      </w:r>
+      <w:proofErr w:type="spellStart"/>
+      <w:r>
+        <w:t>Streamlit</w:t>
+      </w:r>
+      <w:proofErr w:type="spellEnd"/>
+      <w:r>
+        <w:t xml:space="preserve">, Folium, pandas and </w:t>
+      </w:r>
+      <w:proofErr w:type="spellStart"/>
+      <w:r>
+        <w:t>scipy</w:t>
+      </w:r>
+      <w:proofErr w:type="spellEnd"/>
+      <w:r>
+        <w:t xml:space="preserve"> to build the app.</w:t>
       </w:r>
     </w:p>
     <w:p>
       <w:r>
-        <w:t>The gap we fill: most tutorials show either a data dashboard or a security demo, but not both in one small prototype. We wanted one working app where the analytics and the security controls are both real code, not just slides.</w:t>
+        <w:t xml:space="preserve">The gap we fill: most tutorials show either a data dashboard or a security demo, but not </w:t>
+      </w:r>
+      <w:proofErr w:type="gramStart"/>
+      <w:r>
+        <w:t>both in</w:t>
+      </w:r>
+      <w:proofErr w:type="gramEnd"/>
+      <w:r>
+        <w:t xml:space="preserve"> one small prototype. We wanted </w:t>
+      </w:r>
+      <w:proofErr w:type="gramStart"/>
+      <w:r>
+        <w:t>one</w:t>
+      </w:r>
+      <w:proofErr w:type="gramEnd"/>
+      <w:r>
+        <w:t xml:space="preserve"> working app where the analytics and the security controls are both real </w:t>
+      </w:r>
+      <w:proofErr w:type="gramStart"/>
+      <w:r>
+        <w:t>code</w:t>
+      </w:r>
+      <w:proofErr w:type="gramEnd"/>
+      <w:r>
+        <w:t>, not just slides.</w:t>
       </w:r>
     </w:p>
     <w:p>
@@ -478,7 +700,17 @@
         <w:pStyle w:val="ListBullet"/>
       </w:pPr>
       <w:r>
-        <w:t>Hypothesis: neighbourhoods group into a small number of crime-profile clusters, which makes the map easier to read.</w:t>
+        <w:t xml:space="preserve">Hypothesis: </w:t>
+      </w:r>
+      <w:proofErr w:type="spellStart"/>
+      <w:proofErr w:type="gramStart"/>
+      <w:r>
+        <w:t>neighbourhoods</w:t>
+      </w:r>
+      <w:proofErr w:type="spellEnd"/>
+      <w:proofErr w:type="gramEnd"/>
+      <w:r>
+        <w:t xml:space="preserve"> group into a small number of crime-profile clusters, which makes the map easier to read.</w:t>
       </w:r>
     </w:p>
     <w:p>
@@ -486,7 +718,15 @@
         <w:pStyle w:val="ListBullet"/>
       </w:pPr>
       <w:r>
-        <w:t>Assumption: the VPD data is accurate enough for exploration, but it represents reported incidents, not all crime that actually happens.</w:t>
+        <w:t xml:space="preserve">Assumption: the VPD data is accurate enough for exploration, but it represents reported incidents, not all crime that </w:t>
+      </w:r>
+      <w:proofErr w:type="gramStart"/>
+      <w:r>
+        <w:t>actually happens</w:t>
+      </w:r>
+      <w:proofErr w:type="gramEnd"/>
+      <w:r>
+        <w:t>.</w:t>
       </w:r>
     </w:p>
     <w:p>
@@ -529,7 +769,15 @@
         <w:pStyle w:val="ListBullet"/>
       </w:pPr>
       <w:r>
-        <w:t>Download and clean the VPD crime dataset (GeoDASH open data) with a reproducible script pipeline.</w:t>
+        <w:t>Download and clean the VPD crime dataset (</w:t>
+      </w:r>
+      <w:proofErr w:type="spellStart"/>
+      <w:r>
+        <w:t>GeoDASH</w:t>
+      </w:r>
+      <w:proofErr w:type="spellEnd"/>
+      <w:r>
+        <w:t xml:space="preserve"> open data) with a reproducible script pipeline.</w:t>
       </w:r>
     </w:p>
     <w:p>
@@ -537,7 +785,23 @@
         <w:pStyle w:val="ListBullet"/>
       </w:pPr>
       <w:r>
-        <w:t>Build a Streamlit web app with pages for overview, crime map, temporal analysis, statistical analysis, machine learning, an Add Incident form, a security page, and a methodology page.</w:t>
+        <w:t xml:space="preserve">Build a </w:t>
+      </w:r>
+      <w:proofErr w:type="spellStart"/>
+      <w:r>
+        <w:t>Streamlit</w:t>
+      </w:r>
+      <w:proofErr w:type="spellEnd"/>
+      <w:r>
+        <w:t xml:space="preserve"> web app with pages for overview, crime </w:t>
+      </w:r>
+      <w:proofErr w:type="gramStart"/>
+      <w:r>
+        <w:t>map</w:t>
+      </w:r>
+      <w:proofErr w:type="gramEnd"/>
+      <w:r>
+        <w:t>, temporal analysis, statistical analysis, machine learning, an Add Incident form, a security page, and a methodology page.</w:t>
       </w:r>
     </w:p>
     <w:p>
@@ -595,12 +859,28 @@
         <w:pStyle w:val="Heading2"/>
       </w:pPr>
       <w:r>
-        <w:t>3.1 Dataset: VPD GeoDASH open data (as planned), but with a documented gap</w:t>
+        <w:t xml:space="preserve">3.1 Dataset: VPD </w:t>
+      </w:r>
+      <w:proofErr w:type="spellStart"/>
+      <w:r>
+        <w:t>GeoDASH</w:t>
+      </w:r>
+      <w:proofErr w:type="spellEnd"/>
+      <w:r>
+        <w:t xml:space="preserve"> open data (as planned), but with a documented gap</w:t>
       </w:r>
     </w:p>
     <w:p>
       <w:r>
-        <w:t>Change: the dataset has no rows at all for the year 2022, which we found during the quality inspection. We decided not to try to patch it with another source; instead we document it clearly in the app and the reports.</w:t>
+        <w:t xml:space="preserve">Change: the dataset has no rows at all for the year 2022, which we found during the quality inspection. We decided not to try to patch it with another source; </w:t>
+      </w:r>
+      <w:proofErr w:type="gramStart"/>
+      <w:r>
+        <w:t>instead</w:t>
+      </w:r>
+      <w:proofErr w:type="gramEnd"/>
+      <w:r>
+        <w:t xml:space="preserve"> we document it clearly in the app and the reports.</w:t>
       </w:r>
     </w:p>
     <w:p>
@@ -655,7 +935,15 @@
     </w:p>
     <w:p>
       <w:r>
-        <w:t>Change: the map originally used CartoDB tiles, which started asking for an API key. We switched to the free ESRI World Street Map tiles.</w:t>
+        <w:t xml:space="preserve">Change: the map originally used </w:t>
+      </w:r>
+      <w:proofErr w:type="spellStart"/>
+      <w:r>
+        <w:t>CartoDB</w:t>
+      </w:r>
+      <w:proofErr w:type="spellEnd"/>
+      <w:r>
+        <w:t xml:space="preserve"> tiles, which started asking for an API key. We switched to the free ESRI World Street Map tiles.</w:t>
       </w:r>
     </w:p>
     <w:p>
@@ -673,7 +961,23 @@
     </w:p>
     <w:p>
       <w:r>
-        <w:t>Change: the proposal said "machine learning" for forecasting. We built a simple moving-average forecast plus a "same as last year" baseline, with MAE and RMSE scores shown to the user.</w:t>
+        <w:t xml:space="preserve">Change: the proposal said "machine learning" for forecasting. We built a simple moving-average forecast plus </w:t>
+      </w:r>
+      <w:proofErr w:type="gramStart"/>
+      <w:r>
+        <w:t>a "</w:t>
+      </w:r>
+      <w:proofErr w:type="gramEnd"/>
+      <w:r>
+        <w:t xml:space="preserve">same as last year" baseline, with MAE and RMSE scores shown to the </w:t>
+      </w:r>
+      <w:proofErr w:type="gramStart"/>
+      <w:r>
+        <w:t>user</w:t>
+      </w:r>
+      <w:proofErr w:type="gramEnd"/>
+      <w:r>
+        <w:t>.</w:t>
       </w:r>
     </w:p>
     <w:p>
@@ -686,17 +990,41 @@
         <w:pStyle w:val="Heading2"/>
       </w:pPr>
       <w:r>
-        <w:t>3.6 Privacy: neighbourhood-level summaries instead of exact points</w:t>
+        <w:t xml:space="preserve">3.6 Privacy: </w:t>
+      </w:r>
+      <w:proofErr w:type="spellStart"/>
+      <w:r>
+        <w:t>neighbourhood</w:t>
+      </w:r>
+      <w:proofErr w:type="spellEnd"/>
+      <w:r>
+        <w:t>-level summaries instead of exact points</w:t>
       </w:r>
     </w:p>
     <w:p>
       <w:r>
-        <w:t>Change: on the Crime Map we show circles per neighbourhood (with counts and cluster groups) instead of individual incident points.</w:t>
+        <w:t xml:space="preserve">Change: on the Crime Map we show circles per </w:t>
+      </w:r>
+      <w:proofErr w:type="spellStart"/>
+      <w:r>
+        <w:t>neighbourhood</w:t>
+      </w:r>
+      <w:proofErr w:type="spellEnd"/>
+      <w:r>
+        <w:t xml:space="preserve"> (with counts and cluster groups) instead of individual incident points.</w:t>
       </w:r>
     </w:p>
     <w:p>
       <w:r>
-        <w:t>Why: the VPD data only has hundred-block locations, but showing even those as a dot cloud is misleading and less useful than clean neighbourhood summaries. This also follows the data-minimization principle from our privacy review.</w:t>
+        <w:t xml:space="preserve">Why: the VPD data only has hundred-block locations, but showing even those as a dot cloud is misleading and less useful than clean </w:t>
+      </w:r>
+      <w:proofErr w:type="spellStart"/>
+      <w:r>
+        <w:t>neighbourhood</w:t>
+      </w:r>
+      <w:proofErr w:type="spellEnd"/>
+      <w:r>
+        <w:t xml:space="preserve"> summaries. This also follows the data-minimization principle from our privacy review.</w:t>
       </w:r>
     </w:p>
     <w:p>
@@ -821,8 +1149,13 @@
             <w:tcW w:w="2880" w:type="dxa"/>
           </w:tcPr>
           <w:p>
-            <w:r>
-              <w:t>MidCourse submission</w:t>
+            <w:proofErr w:type="spellStart"/>
+            <w:r>
+              <w:t>MidCourse</w:t>
+            </w:r>
+            <w:proofErr w:type="spellEnd"/>
+            <w:r>
+              <w:t xml:space="preserve"> submission</w:t>
             </w:r>
           </w:p>
         </w:tc>
@@ -1117,8 +1450,13 @@
             <w:tcW w:w="4320" w:type="dxa"/>
           </w:tcPr>
           <w:p>
-            <w:r>
-              <w:t>Jaismine Kaur (Team Lead, Data Analytics)</w:t>
+            <w:proofErr w:type="spellStart"/>
+            <w:r>
+              <w:t>Jaismine</w:t>
+            </w:r>
+            <w:proofErr w:type="spellEnd"/>
+            <w:r>
+              <w:t xml:space="preserve"> Kaur (Team Lead, Data Analytics)</w:t>
             </w:r>
           </w:p>
         </w:tc>
@@ -1193,7 +1531,7 @@
                     <pic:cNvPicPr/>
                   </pic:nvPicPr>
                   <pic:blipFill>
-                    <a:blip r:embed="rId6"/>
+                    <a:blip r:embed="rId7"/>
                     <a:stretch>
                       <a:fillRect/>
                     </a:stretch>
@@ -1251,12 +1589,44 @@
     </w:p>
     <w:p>
       <w:r>
-        <w:t>Individual contributions: Shashank built the validation rules, the hour-of-day check, and the security wiring of the database module. Jaismine built the end-to-end form flow and the database module. The two versions were merged into one shared module (app/utils/db.py) on Oct 24.</w:t>
+        <w:t xml:space="preserve">Individual contributions: Shashank built the validation rules, the hour-of-day check, and the security wiring of the database module. </w:t>
+      </w:r>
+      <w:proofErr w:type="spellStart"/>
+      <w:r>
+        <w:t>Jaismine</w:t>
+      </w:r>
+      <w:proofErr w:type="spellEnd"/>
+      <w:r>
+        <w:t xml:space="preserve"> built the end-to-end form flow and the database module. The two versions were merged into one shared module (app/utils/db.py) on Oct 24.</w:t>
       </w:r>
     </w:p>
     <w:p>
       <w:r>
-        <w:t>What it does: only logged-in users with the right role can open the form. They pick a crime type and neighbourhood from dropdown lists (the same 11 types and 24 neighbourhoods as the real data), pick a date (2003 to today, no future dates), an hour, a block-level location, and optional notes. On submit, the record is checked, saved to a SQLite database with a parameterized query, and written to the audit log. Records are tagged source='user' and are never mixed into the public data.</w:t>
+        <w:t xml:space="preserve">What it does: only logged-in users with the right role can open the form. They pick a crime type and </w:t>
+      </w:r>
+      <w:proofErr w:type="spellStart"/>
+      <w:r>
+        <w:t>neighbourhood</w:t>
+      </w:r>
+      <w:proofErr w:type="spellEnd"/>
+      <w:r>
+        <w:t xml:space="preserve"> from dropdown lists (the same 11 types and 24 </w:t>
+      </w:r>
+      <w:proofErr w:type="spellStart"/>
+      <w:r>
+        <w:t>neighbourhoods</w:t>
+      </w:r>
+      <w:proofErr w:type="spellEnd"/>
+      <w:r>
+        <w:t xml:space="preserve"> as the real data), pick a date (2003 to today, no future dates), an hour, a block-level location, and optional notes. On </w:t>
+      </w:r>
+      <w:proofErr w:type="gramStart"/>
+      <w:r>
+        <w:t>submit</w:t>
+      </w:r>
+      <w:proofErr w:type="gramEnd"/>
+      <w:r>
+        <w:t>, the record is checked, saved to a SQLite database with a parameterized query, and written to the audit log. Records are tagged source='user' and are never mixed into the public data.</w:t>
       </w:r>
     </w:p>
     <w:p>
@@ -1309,7 +1679,7 @@
                     <pic:cNvPicPr/>
                   </pic:nvPicPr>
                   <pic:blipFill>
-                    <a:blip r:embed="rId7"/>
+                    <a:blip r:embed="rId8"/>
                     <a:stretch>
                       <a:fillRect/>
                     </a:stretch>
@@ -1352,7 +1722,7 @@
                     <pic:cNvPicPr/>
                   </pic:nvPicPr>
                   <pic:blipFill>
-                    <a:blip r:embed="rId8"/>
+                    <a:blip r:embed="rId9"/>
                     <a:stretch>
                       <a:fillRect/>
                     </a:stretch>
@@ -1394,7 +1764,7 @@
                     <pic:cNvPicPr/>
                   </pic:nvPicPr>
                   <pic:blipFill>
-                    <a:blip r:embed="rId9"/>
+                    <a:blip r:embed="rId10"/>
                     <a:stretch>
                       <a:fillRect/>
                     </a:stretch>
@@ -1437,7 +1807,7 @@
                     <pic:cNvPicPr/>
                   </pic:nvPicPr>
                   <pic:blipFill>
-                    <a:blip r:embed="rId10"/>
+                    <a:blip r:embed="rId11"/>
                     <a:stretch>
                       <a:fillRect/>
                     </a:stretch>
@@ -1506,7 +1876,7 @@
                     <pic:cNvPicPr/>
                   </pic:nvPicPr>
                   <pic:blipFill>
-                    <a:blip r:embed="rId11"/>
+                    <a:blip r:embed="rId12"/>
                     <a:stretch>
                       <a:fillRect/>
                     </a:stretch>
@@ -1557,7 +1927,7 @@
                     <pic:cNvPicPr/>
                   </pic:nvPicPr>
                   <pic:blipFill>
-                    <a:blip r:embed="rId12"/>
+                    <a:blip r:embed="rId13"/>
                     <a:stretch>
                       <a:fillRect/>
                     </a:stretch>
@@ -1607,7 +1977,7 @@
                     <pic:cNvPicPr/>
                   </pic:nvPicPr>
                   <pic:blipFill>
-                    <a:blip r:embed="rId13"/>
+                    <a:blip r:embed="rId14"/>
                     <a:stretch>
                       <a:fillRect/>
                     </a:stretch>
@@ -1650,7 +2020,7 @@
                     <pic:cNvPicPr/>
                   </pic:nvPicPr>
                   <pic:blipFill>
-                    <a:blip r:embed="rId14"/>
+                    <a:blip r:embed="rId15"/>
                     <a:stretch>
                       <a:fillRect/>
                     </a:stretch>
@@ -1681,12 +2051,36 @@
     </w:p>
     <w:p>
       <w:r>
-        <w:t>Individual contribution: Shashank (with Jaismine reviewing).</w:t>
+        <w:t xml:space="preserve">Individual contribution: Shashank (with </w:t>
+      </w:r>
+      <w:proofErr w:type="spellStart"/>
+      <w:r>
+        <w:t>Jaismine</w:t>
+      </w:r>
+      <w:proofErr w:type="spellEnd"/>
+      <w:r>
+        <w:t xml:space="preserve"> reviewing).</w:t>
       </w:r>
     </w:p>
     <w:p>
       <w:r>
-        <w:t>What it does: three scripts download the VPD dataset, inspect its quality, and clean it (928,362 rows -&gt; 893,851 rows). The cleaning removes duplicates, standardizes text, flags zero coordinates, and adds year/month/day/hour/season columns. Every step is written to a log file. Key findings documented: missing year 2022, 34,511 duplicate rows, 83,020 rows with zero coordinates.</w:t>
+        <w:t xml:space="preserve">What it does: </w:t>
+      </w:r>
+      <w:proofErr w:type="gramStart"/>
+      <w:r>
+        <w:t>three scripts download</w:t>
+      </w:r>
+      <w:proofErr w:type="gramEnd"/>
+      <w:r>
+        <w:t xml:space="preserve"> the VPD dataset, inspect its quality, and clean it (928,362 rows -&gt; 893,851 rows). The cleaning removes duplicates, standardizes text, flags zero coordinates, and adds year/month/day/hour/season columns. Every step is written </w:t>
+      </w:r>
+      <w:proofErr w:type="gramStart"/>
+      <w:r>
+        <w:t>to</w:t>
+      </w:r>
+      <w:proofErr w:type="gramEnd"/>
+      <w:r>
+        <w:t xml:space="preserve"> a log file. Key findings documented: missing year 2022, 34,511 duplicate rows, 83,020 rows with zero coordinates.</w:t>
       </w:r>
     </w:p>
     <w:p>
@@ -1710,7 +2104,7 @@
                     <pic:cNvPicPr/>
                   </pic:nvPicPr>
                   <pic:blipFill>
-                    <a:blip r:embed="rId15"/>
+                    <a:blip r:embed="rId16"/>
                     <a:stretch>
                       <a:fillRect/>
                     </a:stretch>
@@ -1754,7 +2148,7 @@
                     <pic:cNvPicPr/>
                   </pic:nvPicPr>
                   <pic:blipFill>
-                    <a:blip r:embed="rId16"/>
+                    <a:blip r:embed="rId17"/>
                     <a:stretch>
                       <a:fillRect/>
                     </a:stretch>
@@ -1797,7 +2191,7 @@
                     <pic:cNvPicPr/>
                   </pic:nvPicPr>
                   <pic:blipFill>
-                    <a:blip r:embed="rId17"/>
+                    <a:blip r:embed="rId18"/>
                     <a:stretch>
                       <a:fillRect/>
                     </a:stretch>
@@ -1840,7 +2234,7 @@
                     <pic:cNvPicPr/>
                   </pic:nvPicPr>
                   <pic:blipFill>
-                    <a:blip r:embed="rId18"/>
+                    <a:blip r:embed="rId19"/>
                     <a:stretch>
                       <a:fillRect/>
                     </a:stretch>
@@ -1871,7 +2265,15 @@
     </w:p>
     <w:p>
       <w:r>
-        <w:t>Individual contribution: Jaismine (pages), with the pipeline and dataset documentation from Shashank.</w:t>
+        <w:t xml:space="preserve">Individual contribution: </w:t>
+      </w:r>
+      <w:proofErr w:type="spellStart"/>
+      <w:r>
+        <w:t>Jaismine</w:t>
+      </w:r>
+      <w:proofErr w:type="spellEnd"/>
+      <w:r>
+        <w:t xml:space="preserve"> (pages), with the pipeline and dataset documentation from Shashank.</w:t>
       </w:r>
     </w:p>
     <w:p>
@@ -1901,7 +2303,7 @@
                     <pic:cNvPicPr/>
                   </pic:nvPicPr>
                   <pic:blipFill>
-                    <a:blip r:embed="rId19"/>
+                    <a:blip r:embed="rId20"/>
                     <a:stretch>
                       <a:fillRect/>
                     </a:stretch>
@@ -1943,7 +2345,7 @@
                     <pic:cNvPicPr/>
                   </pic:nvPicPr>
                   <pic:blipFill>
-                    <a:blip r:embed="rId20"/>
+                    <a:blip r:embed="rId21"/>
                     <a:stretch>
                       <a:fillRect/>
                     </a:stretch>
@@ -1986,7 +2388,7 @@
                     <pic:cNvPicPr/>
                   </pic:nvPicPr>
                   <pic:blipFill>
-                    <a:blip r:embed="rId21"/>
+                    <a:blip r:embed="rId22"/>
                     <a:stretch>
                       <a:fillRect/>
                     </a:stretch>
@@ -2025,50 +2427,6 @@
                 <pic:pic xmlns:pic="http://schemas.openxmlformats.org/drawingml/2006/picture">
                   <pic:nvPicPr>
                     <pic:cNvPr id="549676005" name=""/>
-                    <pic:cNvPicPr/>
-                  </pic:nvPicPr>
-                  <pic:blipFill>
-                    <a:blip r:embed="rId22"/>
-                    <a:stretch>
-                      <a:fillRect/>
-                    </a:stretch>
-                  </pic:blipFill>
-                  <pic:spPr>
-                    <a:xfrm>
-                      <a:off x="0" y="0"/>
-                      <a:ext cx="5486400" cy="2697480"/>
-                    </a:xfrm>
-                    <a:prstGeom prst="rect">
-                      <a:avLst/>
-                    </a:prstGeom>
-                  </pic:spPr>
-                </pic:pic>
-              </a:graphicData>
-            </a:graphic>
-          </wp:inline>
-        </w:drawing>
-      </w:r>
-    </w:p>
-    <w:p/>
-    <w:p>
-      <w:r>
-        <w:rPr>
-          <w:noProof/>
-        </w:rPr>
-        <w:lastRenderedPageBreak/>
-        <w:drawing>
-          <wp:inline distT="0" distB="0" distL="0" distR="0" wp14:anchorId="421BEB3E" wp14:editId="58EDB6D3">
-            <wp:extent cx="5486400" cy="2697480"/>
-            <wp:effectExtent l="0" t="0" r="0" b="7620"/>
-            <wp:docPr id="1088431664" name="Picture 1"/>
-            <wp:cNvGraphicFramePr>
-              <a:graphicFrameLocks xmlns:a="http://schemas.openxmlformats.org/drawingml/2006/main" noChangeAspect="1"/>
-            </wp:cNvGraphicFramePr>
-            <a:graphic xmlns:a="http://schemas.openxmlformats.org/drawingml/2006/main">
-              <a:graphicData uri="http://schemas.openxmlformats.org/drawingml/2006/picture">
-                <pic:pic xmlns:pic="http://schemas.openxmlformats.org/drawingml/2006/picture">
-                  <pic:nvPicPr>
-                    <pic:cNvPr id="1088431664" name=""/>
                     <pic:cNvPicPr/>
                   </pic:nvPicPr>
                   <pic:blipFill>
@@ -2093,6 +2451,50 @@
         </w:drawing>
       </w:r>
     </w:p>
+    <w:p/>
+    <w:p>
+      <w:r>
+        <w:rPr>
+          <w:noProof/>
+        </w:rPr>
+        <w:lastRenderedPageBreak/>
+        <w:drawing>
+          <wp:inline distT="0" distB="0" distL="0" distR="0" wp14:anchorId="421BEB3E" wp14:editId="58EDB6D3">
+            <wp:extent cx="5486400" cy="2697480"/>
+            <wp:effectExtent l="0" t="0" r="0" b="7620"/>
+            <wp:docPr id="1088431664" name="Picture 1"/>
+            <wp:cNvGraphicFramePr>
+              <a:graphicFrameLocks xmlns:a="http://schemas.openxmlformats.org/drawingml/2006/main" noChangeAspect="1"/>
+            </wp:cNvGraphicFramePr>
+            <a:graphic xmlns:a="http://schemas.openxmlformats.org/drawingml/2006/main">
+              <a:graphicData uri="http://schemas.openxmlformats.org/drawingml/2006/picture">
+                <pic:pic xmlns:pic="http://schemas.openxmlformats.org/drawingml/2006/picture">
+                  <pic:nvPicPr>
+                    <pic:cNvPr id="1088431664" name=""/>
+                    <pic:cNvPicPr/>
+                  </pic:nvPicPr>
+                  <pic:blipFill>
+                    <a:blip r:embed="rId24"/>
+                    <a:stretch>
+                      <a:fillRect/>
+                    </a:stretch>
+                  </pic:blipFill>
+                  <pic:spPr>
+                    <a:xfrm>
+                      <a:off x="0" y="0"/>
+                      <a:ext cx="5486400" cy="2697480"/>
+                    </a:xfrm>
+                    <a:prstGeom prst="rect">
+                      <a:avLst/>
+                    </a:prstGeom>
+                  </pic:spPr>
+                </pic:pic>
+              </a:graphicData>
+            </a:graphic>
+          </wp:inline>
+        </w:drawing>
+      </w:r>
+    </w:p>
     <w:p>
       <w:r>
         <w:rPr>
@@ -2114,7 +2516,7 @@
                     <pic:cNvPicPr/>
                   </pic:nvPicPr>
                   <pic:blipFill>
-                    <a:blip r:embed="rId24"/>
+                    <a:blip r:embed="rId25"/>
                     <a:stretch>
                       <a:fillRect/>
                     </a:stretch>
@@ -2157,7 +2559,7 @@
                     <pic:cNvPicPr/>
                   </pic:nvPicPr>
                   <pic:blipFill>
-                    <a:blip r:embed="rId25"/>
+                    <a:blip r:embed="rId26"/>
                     <a:stretch>
                       <a:fillRect/>
                     </a:stretch>
@@ -2199,7 +2601,7 @@
                     <pic:cNvPicPr/>
                   </pic:nvPicPr>
                   <pic:blipFill>
-                    <a:blip r:embed="rId26"/>
+                    <a:blip r:embed="rId27"/>
                     <a:stretch>
                       <a:fillRect/>
                     </a:stretch>
@@ -2241,7 +2643,7 @@
                     <pic:cNvPicPr/>
                   </pic:nvPicPr>
                   <pic:blipFill>
-                    <a:blip r:embed="rId27"/>
+                    <a:blip r:embed="rId28"/>
                     <a:stretch>
                       <a:fillRect/>
                     </a:stretch>
@@ -2284,7 +2686,7 @@
                     <pic:cNvPicPr/>
                   </pic:nvPicPr>
                   <pic:blipFill>
-                    <a:blip r:embed="rId28"/>
+                    <a:blip r:embed="rId29"/>
                     <a:stretch>
                       <a:fillRect/>
                     </a:stretch>
@@ -2310,17 +2712,57 @@
         <w:pStyle w:val="Heading2"/>
       </w:pPr>
       <w:r>
-        <w:t>5.5 Feature 5: Crime Map with neighbourhood clustering</w:t>
+        <w:t xml:space="preserve">5.5 Feature 5: Crime Map with </w:t>
+      </w:r>
+      <w:proofErr w:type="spellStart"/>
+      <w:r>
+        <w:t>neighbourhood</w:t>
+      </w:r>
+      <w:proofErr w:type="spellEnd"/>
+      <w:r>
+        <w:t xml:space="preserve"> clustering</w:t>
       </w:r>
     </w:p>
     <w:p>
       <w:r>
-        <w:t>Individual contribution: Jaismine.</w:t>
+        <w:t xml:space="preserve">Individual contribution: </w:t>
+      </w:r>
+      <w:proofErr w:type="spellStart"/>
+      <w:r>
+        <w:t>Jaismine</w:t>
+      </w:r>
+      <w:proofErr w:type="spellEnd"/>
+      <w:r>
+        <w:t>.</w:t>
       </w:r>
     </w:p>
     <w:p>
       <w:r>
-        <w:t>What it does: converts the data's UTM coordinates to latitude and longitude, aggregates incidents per neighbourhood (privacy-safe), groups neighbourhoods with similar crime mixes using k-means clustering, and shows them on an interactive Folium map on free ESRI tiles with hover popups and click-to-highlight. A plain-English guide and summary table help non-technical users.</w:t>
+        <w:t xml:space="preserve">What it does: converts the data's UTM coordinates to latitude and longitude, aggregates incidents per </w:t>
+      </w:r>
+      <w:proofErr w:type="spellStart"/>
+      <w:r>
+        <w:t>neighbourhood</w:t>
+      </w:r>
+      <w:proofErr w:type="spellEnd"/>
+      <w:r>
+        <w:t xml:space="preserve"> (privacy-safe), groups </w:t>
+      </w:r>
+      <w:proofErr w:type="spellStart"/>
+      <w:r>
+        <w:t>neighbourhoods</w:t>
+      </w:r>
+      <w:proofErr w:type="spellEnd"/>
+      <w:r>
+        <w:t xml:space="preserve"> with similar crime mixes using k-means </w:t>
+      </w:r>
+      <w:proofErr w:type="gramStart"/>
+      <w:r>
+        <w:t>clustering, and</w:t>
+      </w:r>
+      <w:proofErr w:type="gramEnd"/>
+      <w:r>
+        <w:t xml:space="preserve"> shows them on an interactive Folium map on free ESRI tiles with hover popups and click-to-highlight. A plain-English guide and summary table help non-technical users.</w:t>
       </w:r>
     </w:p>
     <w:p>
@@ -2333,12 +2775,36 @@
     </w:p>
     <w:p>
       <w:r>
-        <w:t>Individual contribution: Jaismine (page and stats module), with a datetime parsing fix identified together and fixed by Jaismine.</w:t>
+        <w:t xml:space="preserve">Individual contribution: </w:t>
+      </w:r>
+      <w:proofErr w:type="spellStart"/>
+      <w:r>
+        <w:t>Jaismine</w:t>
+      </w:r>
+      <w:proofErr w:type="spellEnd"/>
+      <w:r>
+        <w:t xml:space="preserve"> (page and stats module), with a datetime parsing fix identified together and fixed by </w:t>
+      </w:r>
+      <w:proofErr w:type="spellStart"/>
+      <w:r>
+        <w:t>Jaismine</w:t>
+      </w:r>
+      <w:proofErr w:type="spellEnd"/>
+      <w:r>
+        <w:t>.</w:t>
       </w:r>
     </w:p>
     <w:p>
       <w:r>
-        <w:t>What it does: two chi-square tests - crime type x season and crime type x day of week - with observed/expected tables, p-values, and plain-English conclusions. Also a season-share heatmap. The page explains what the test means instead of only showing numbers.</w:t>
+        <w:t xml:space="preserve">What it does: two chi-square tests - crime type x season and crime type x day of week - with observed/expected tables, p-values, and plain-English conclusions. </w:t>
+      </w:r>
+      <w:proofErr w:type="gramStart"/>
+      <w:r>
+        <w:t>Also</w:t>
+      </w:r>
+      <w:proofErr w:type="gramEnd"/>
+      <w:r>
+        <w:t xml:space="preserve"> a season-share heatmap. The page explains what the test means instead of only showing numbers.</w:t>
       </w:r>
     </w:p>
     <w:p>
@@ -2351,7 +2817,15 @@
     </w:p>
     <w:p>
       <w:r>
-        <w:t>Individual contribution: Jaismine.</w:t>
+        <w:t xml:space="preserve">Individual contribution: </w:t>
+      </w:r>
+      <w:proofErr w:type="spellStart"/>
+      <w:r>
+        <w:t>Jaismine</w:t>
+      </w:r>
+      <w:proofErr w:type="spellEnd"/>
+      <w:r>
+        <w:t>.</w:t>
       </w:r>
     </w:p>
     <w:p>
@@ -2375,7 +2849,15 @@
     <w:p>
       <w:r>
         <w:lastRenderedPageBreak/>
-        <w:t>What it does: threat model v0.4 with assets, threat actors, STRIDE analysis, OWASP Top 10 mapping, a controls table with implemented statuses, and a security testing plan. Privacy review v0.1 covers data inventory, privacy principles, credential handling, and location-data handling. The documents stay in sync with the code: when a control gets implemented, the status is updated.</w:t>
+        <w:t xml:space="preserve">What it does: threat model v0.4 with assets, threat actors, STRIDE analysis, OWASP Top 10 mapping, a controls table with implemented statuses, and a security testing plan. Privacy review v0.1 covers data inventory, privacy principles, credential handling, and location-data handling. The documents stay in sync with the code: when </w:t>
+      </w:r>
+      <w:proofErr w:type="gramStart"/>
+      <w:r>
+        <w:t>a control</w:t>
+      </w:r>
+      <w:proofErr w:type="gramEnd"/>
+      <w:r>
+        <w:t xml:space="preserve"> gets implemented, the status is updated.</w:t>
       </w:r>
     </w:p>
     <w:p>
@@ -2479,9 +2961,11 @@
             <w:tcW w:w="2160" w:type="dxa"/>
           </w:tcPr>
           <w:p>
+            <w:proofErr w:type="spellStart"/>
             <w:r>
               <w:t>opencode</w:t>
             </w:r>
+            <w:proofErr w:type="spellEnd"/>
           </w:p>
         </w:tc>
         <w:tc>
@@ -2499,8 +2983,21 @@
             <w:tcW w:w="2160" w:type="dxa"/>
           </w:tcPr>
           <w:p>
-            <w:r>
-              <w:t>Helped draft and debug Python for the data pipeline, validation module, SQLite store, Streamlit pages, and unit tests; suggested structures for the threat model and privacy documents; helped resolve the git merge between the two members' overlapping Add Incident work.</w:t>
+            <w:proofErr w:type="gramStart"/>
+            <w:r>
+              <w:t>Helped</w:t>
+            </w:r>
+            <w:proofErr w:type="gramEnd"/>
+            <w:r>
+              <w:t xml:space="preserve"> draft and debug Python for the data pipeline, validation module, SQLite store, </w:t>
+            </w:r>
+            <w:proofErr w:type="spellStart"/>
+            <w:r>
+              <w:t>Streamlit</w:t>
+            </w:r>
+            <w:proofErr w:type="spellEnd"/>
+            <w:r>
+              <w:t xml:space="preserve"> pages, and unit tests; suggested structures for the threat model and privacy documents; helped resolve the git merge between the two members' overlapping Add Incident work.</w:t>
             </w:r>
           </w:p>
         </w:tc>
@@ -2571,7 +3068,31 @@
     </w:p>
     <w:p>
       <w:r>
-        <w:t>The AI gave us drafts and shortcuts, but the actual work and the final decisions are ours. We chose the dataset, decided how to handle duplicates and zero coordinates, picked the honest-baseline forecast over a fancy model, decided the three roles and their permissions, and chose which security controls to actually build. We ran every test, checked the numbers against the real data, demoed the app to find what felt confusing, and fixed bugs the AI never saw. Every work log entry and every summary in this report is written in our own words about work we actually did.</w:t>
+        <w:t xml:space="preserve">The AI gave us drafts and shortcuts, but the actual work and the final decisions are ours. We chose the dataset, decided how to handle duplicates and zero coordinates, picked the honest-baseline forecast over a fancy model, decided the three roles and their permissions, and chose which security controls to </w:t>
+      </w:r>
+      <w:proofErr w:type="gramStart"/>
+      <w:r>
+        <w:t>actually build</w:t>
+      </w:r>
+      <w:proofErr w:type="gramEnd"/>
+      <w:r>
+        <w:t xml:space="preserve">. We ran every test, checked the numbers against the real data, demoed the app to find what felt confusing, and fixed bugs the AI never saw. Every work </w:t>
+      </w:r>
+      <w:proofErr w:type="gramStart"/>
+      <w:r>
+        <w:t>log</w:t>
+      </w:r>
+      <w:proofErr w:type="gramEnd"/>
+      <w:r>
+        <w:t xml:space="preserve"> entry and every summary in this report is written in our own words about work we </w:t>
+      </w:r>
+      <w:proofErr w:type="gramStart"/>
+      <w:r>
+        <w:t>actually did</w:t>
+      </w:r>
+      <w:proofErr w:type="gramEnd"/>
+      <w:r>
+        <w:t>.</w:t>
       </w:r>
     </w:p>
     <w:p>
@@ -2721,9 +3242,11 @@
             <w:tcW w:w="2160" w:type="dxa"/>
           </w:tcPr>
           <w:p>
+            <w:proofErr w:type="spellStart"/>
             <w:r>
               <w:t>opencode</w:t>
             </w:r>
+            <w:proofErr w:type="spellEnd"/>
           </w:p>
         </w:tc>
         <w:tc>
@@ -2732,7 +3255,23 @@
           </w:tcPr>
           <w:p>
             <w:r>
-              <w:t>How can I download the VPD GeoDASH crime dataset for all neighbourhoods and years?</w:t>
+              <w:t xml:space="preserve">How can I download the VPD </w:t>
+            </w:r>
+            <w:proofErr w:type="spellStart"/>
+            <w:r>
+              <w:t>GeoDASH</w:t>
+            </w:r>
+            <w:proofErr w:type="spellEnd"/>
+            <w:r>
+              <w:t xml:space="preserve"> crime dataset for all </w:t>
+            </w:r>
+            <w:proofErr w:type="spellStart"/>
+            <w:r>
+              <w:t>neighbourhoods</w:t>
+            </w:r>
+            <w:proofErr w:type="spellEnd"/>
+            <w:r>
+              <w:t xml:space="preserve"> and years?</w:t>
             </w:r>
           </w:p>
         </w:tc>
@@ -2766,9 +3305,11 @@
             <w:tcW w:w="2160" w:type="dxa"/>
           </w:tcPr>
           <w:p>
+            <w:proofErr w:type="spellStart"/>
             <w:r>
               <w:t>opencode</w:t>
             </w:r>
+            <w:proofErr w:type="spellEnd"/>
           </w:p>
         </w:tc>
         <w:tc>
@@ -2811,9 +3352,11 @@
             <w:tcW w:w="2160" w:type="dxa"/>
           </w:tcPr>
           <w:p>
+            <w:proofErr w:type="spellStart"/>
             <w:r>
               <w:t>opencode</w:t>
             </w:r>
+            <w:proofErr w:type="spellEnd"/>
           </w:p>
         </w:tc>
         <w:tc>
@@ -2856,9 +3399,11 @@
             <w:tcW w:w="2160" w:type="dxa"/>
           </w:tcPr>
           <w:p>
+            <w:proofErr w:type="spellStart"/>
             <w:r>
               <w:t>opencode</w:t>
             </w:r>
+            <w:proofErr w:type="spellEnd"/>
           </w:p>
         </w:tc>
         <w:tc>
@@ -2901,9 +3446,11 @@
             <w:tcW w:w="2160" w:type="dxa"/>
           </w:tcPr>
           <w:p>
+            <w:proofErr w:type="spellStart"/>
             <w:r>
               <w:t>opencode</w:t>
             </w:r>
+            <w:proofErr w:type="spellEnd"/>
           </w:p>
         </w:tc>
         <w:tc>
@@ -2946,9 +3493,11 @@
             <w:tcW w:w="2160" w:type="dxa"/>
           </w:tcPr>
           <w:p>
+            <w:proofErr w:type="spellStart"/>
             <w:r>
               <w:t>opencode</w:t>
             </w:r>
+            <w:proofErr w:type="spellEnd"/>
           </w:p>
         </w:tc>
         <w:tc>
@@ -2991,9 +3540,11 @@
             <w:tcW w:w="2160" w:type="dxa"/>
           </w:tcPr>
           <w:p>
+            <w:proofErr w:type="spellStart"/>
             <w:r>
               <w:t>opencode</w:t>
             </w:r>
+            <w:proofErr w:type="spellEnd"/>
           </w:p>
         </w:tc>
         <w:tc>
@@ -3002,7 +3553,15 @@
           </w:tcPr>
           <w:p>
             <w:r>
-              <w:t>How do I build a Streamlit form with dropdowns and show validation errors?</w:t>
+              <w:t xml:space="preserve">How do I build a </w:t>
+            </w:r>
+            <w:proofErr w:type="spellStart"/>
+            <w:r>
+              <w:t>Streamlit</w:t>
+            </w:r>
+            <w:proofErr w:type="spellEnd"/>
+            <w:r>
+              <w:t xml:space="preserve"> form with dropdowns and show validation errors?</w:t>
             </w:r>
           </w:p>
         </w:tc>
@@ -3011,8 +3570,13 @@
             <w:tcW w:w="2160" w:type="dxa"/>
           </w:tcPr>
           <w:p>
-            <w:r>
-              <w:t>Rebuilt the Add Incident form</w:t>
+            <w:proofErr w:type="gramStart"/>
+            <w:r>
+              <w:t>Rebuilt</w:t>
+            </w:r>
+            <w:proofErr w:type="gramEnd"/>
+            <w:r>
+              <w:t xml:space="preserve"> the Add Incident form</w:t>
             </w:r>
           </w:p>
         </w:tc>
@@ -3092,7 +3656,15 @@
           </w:tcPr>
           <w:p>
             <w:r>
-              <w:t>What is an honest way to show forecast error to users?</w:t>
+              <w:t xml:space="preserve">What is an honest way to show forecast </w:t>
+            </w:r>
+            <w:proofErr w:type="gramStart"/>
+            <w:r>
+              <w:t>error</w:t>
+            </w:r>
+            <w:proofErr w:type="gramEnd"/>
+            <w:r>
+              <w:t xml:space="preserve"> to users?</w:t>
             </w:r>
           </w:p>
         </w:tc>
@@ -3126,9 +3698,11 @@
             <w:tcW w:w="2160" w:type="dxa"/>
           </w:tcPr>
           <w:p>
+            <w:proofErr w:type="spellStart"/>
             <w:r>
               <w:t>opencode</w:t>
             </w:r>
+            <w:proofErr w:type="spellEnd"/>
           </w:p>
         </w:tc>
         <w:tc>
@@ -3137,7 +3711,15 @@
           </w:tcPr>
           <w:p>
             <w:r>
-              <w:t>How do I test SQL injection safety in pytest?</w:t>
+              <w:t xml:space="preserve">How do I test SQL injection safety in </w:t>
+            </w:r>
+            <w:proofErr w:type="spellStart"/>
+            <w:r>
+              <w:t>pytest</w:t>
+            </w:r>
+            <w:proofErr w:type="spellEnd"/>
+            <w:r>
+              <w:t>?</w:t>
             </w:r>
           </w:p>
         </w:tc>
@@ -3171,9 +3753,11 @@
             <w:tcW w:w="2160" w:type="dxa"/>
           </w:tcPr>
           <w:p>
+            <w:proofErr w:type="spellStart"/>
             <w:r>
               <w:t>opencode</w:t>
             </w:r>
+            <w:proofErr w:type="spellEnd"/>
           </w:p>
         </w:tc>
         <w:tc>
@@ -3209,6 +3793,7 @@
     </w:tbl>
     <w:p>
       <w:r>
+        <w:lastRenderedPageBreak/>
         <w:br w:type="page"/>
       </w:r>
     </w:p>
@@ -3420,7 +4005,20 @@
           </w:tcPr>
           <w:p>
             <w:r>
-              <w:t>Project setup: created folder structure; added .gitignore; wrote scripts/00_download_data.py for reproducible data acquisition</w:t>
+              <w:t xml:space="preserve">Project setup: created folder structure; </w:t>
+            </w:r>
+            <w:proofErr w:type="gramStart"/>
+            <w:r>
+              <w:t>added .</w:t>
+            </w:r>
+            <w:proofErr w:type="spellStart"/>
+            <w:r>
+              <w:t>gitignore</w:t>
+            </w:r>
+            <w:proofErr w:type="spellEnd"/>
+            <w:proofErr w:type="gramEnd"/>
+            <w:r>
+              <w:t>; wrote scripts/00_download_data.py for reproducible data acquisition</w:t>
             </w:r>
           </w:p>
         </w:tc>
@@ -3455,7 +4053,15 @@
           </w:tcPr>
           <w:p>
             <w:r>
-              <w:t>Data acquisition: downloaded VPD crime dataset from GeoDASH open data; wrote scripts/01_inspect_data.py; generated data quality summary (927,794 rows; 34,527 duplicates; missing 2022; 83K zero coordinates)</w:t>
+              <w:t xml:space="preserve">Data acquisition: downloaded VPD crime dataset from </w:t>
+            </w:r>
+            <w:proofErr w:type="spellStart"/>
+            <w:r>
+              <w:t>GeoDASH</w:t>
+            </w:r>
+            <w:proofErr w:type="spellEnd"/>
+            <w:r>
+              <w:t xml:space="preserve"> open data; wrote scripts/01_inspect_data.py; generated data quality summary (927,794 rows; 34,527 duplicates; missing 2022; 83K zero coordinates)</w:t>
             </w:r>
           </w:p>
         </w:tc>
@@ -3525,7 +4131,15 @@
           </w:tcPr>
           <w:p>
             <w:r>
-              <w:t>Documentation: wrote docs/research/dataset_documentation.md covering source, schema, quality findings, and privacy notes</w:t>
+              <w:t xml:space="preserve">Documentation: </w:t>
+            </w:r>
+            <w:proofErr w:type="gramStart"/>
+            <w:r>
+              <w:t>wrote</w:t>
+            </w:r>
+            <w:proofErr w:type="gramEnd"/>
+            <w:r>
+              <w:t xml:space="preserve"> docs/research/dataset_documentation.md covering source, schema, quality findings, and privacy notes</w:t>
             </w:r>
           </w:p>
         </w:tc>
@@ -3736,7 +4350,23 @@
           </w:tcPr>
           <w:p>
             <w:r>
-              <w:t>Input validation module: wrote app/utils/validation.py - allow-lists for the 11 crime types and 24 neighbourhoods, date range checks, length limits, and HTML/script sanitization to prevent stored XSS</w:t>
+              <w:t xml:space="preserve">Input validation </w:t>
+            </w:r>
+            <w:proofErr w:type="gramStart"/>
+            <w:r>
+              <w:t>module:</w:t>
+            </w:r>
+            <w:proofErr w:type="gramEnd"/>
+            <w:r>
+              <w:t xml:space="preserve"> wrote app/utils/validation.py - allow-lists for the 11 crime types and 24 </w:t>
+            </w:r>
+            <w:proofErr w:type="spellStart"/>
+            <w:r>
+              <w:t>neighbourhoods</w:t>
+            </w:r>
+            <w:proofErr w:type="spellEnd"/>
+            <w:r>
+              <w:t>, date range checks, length limits, and HTML/script sanitization to prevent stored XSS</w:t>
             </w:r>
           </w:p>
         </w:tc>
@@ -3911,7 +4541,15 @@
           </w:tcPr>
           <w:p>
             <w:r>
-              <w:t>App polish: removed roadmap/phase-date notes from app pages; updated Security page control statuses; installed scipy and re-verified the Statistical Analysis page</w:t>
+              <w:t xml:space="preserve">App polish: removed roadmap/phase-date notes from app pages; updated Security page control statuses; installed </w:t>
+            </w:r>
+            <w:proofErr w:type="spellStart"/>
+            <w:r>
+              <w:t>scipy</w:t>
+            </w:r>
+            <w:proofErr w:type="spellEnd"/>
+            <w:r>
+              <w:t xml:space="preserve"> and re-verified the Statistical Analysis page</w:t>
             </w:r>
           </w:p>
         </w:tc>
@@ -4051,7 +4689,15 @@
           </w:tcPr>
           <w:p>
             <w:r>
-              <w:t>Testing: extended tests/test_db.py (hour/role storage, per-user record filtering, count, SQL-injection-as-literal-text); merged with Jaismine's parallel Add Incident work into one shared db.py module; full suite now 73 tests passing</w:t>
+              <w:t xml:space="preserve">Testing: extended tests/test_db.py (hour/role storage, per-user record filtering, count, SQL-injection-as-literal-text); merged with </w:t>
+            </w:r>
+            <w:proofErr w:type="spellStart"/>
+            <w:r>
+              <w:t>Jaismine's</w:t>
+            </w:r>
+            <w:proofErr w:type="spellEnd"/>
+            <w:r>
+              <w:t xml:space="preserve"> parallel Add Incident work into one shared db.py module; full suite now 73 tests passing</w:t>
             </w:r>
           </w:p>
         </w:tc>
@@ -4098,7 +4744,15 @@
       </w:pPr>
       <w:r>
         <w:lastRenderedPageBreak/>
-        <w:t>7.2 Jaismine Kaur (300415820)</w:t>
+        <w:t xml:space="preserve">7.2 </w:t>
+      </w:r>
+      <w:proofErr w:type="spellStart"/>
+      <w:r>
+        <w:t>Jaismine</w:t>
+      </w:r>
+      <w:proofErr w:type="spellEnd"/>
+      <w:r>
+        <w:t xml:space="preserve"> Kaur (300415820)</w:t>
       </w:r>
     </w:p>
     <w:tbl>
@@ -4326,8 +4980,13 @@
             <w:tcW w:w="2880" w:type="dxa"/>
           </w:tcPr>
           <w:p>
-            <w:r>
-              <w:t>Helped write the document that explains our data - where it comes from, what each column means, and its known problems</w:t>
+            <w:proofErr w:type="gramStart"/>
+            <w:r>
+              <w:t>Helped</w:t>
+            </w:r>
+            <w:proofErr w:type="gramEnd"/>
+            <w:r>
+              <w:t xml:space="preserve"> write the document that explains our data - where it comes from, what each column means, and its known problems</w:t>
             </w:r>
           </w:p>
         </w:tc>
@@ -4432,7 +5091,15 @@
           </w:tcPr>
           <w:p>
             <w:r>
-              <w:t>Read the privacy notes document and checked it over</w:t>
+              <w:t xml:space="preserve">Read the privacy notes document and </w:t>
+            </w:r>
+            <w:proofErr w:type="gramStart"/>
+            <w:r>
+              <w:t>checked</w:t>
+            </w:r>
+            <w:proofErr w:type="gramEnd"/>
+            <w:r>
+              <w:t xml:space="preserve"> it over</w:t>
             </w:r>
           </w:p>
         </w:tc>
@@ -4541,7 +5208,15 @@
             </w:r>
             <w:r>
               <w:lastRenderedPageBreak/>
-              <w:t>preparation process myself from start to finish: download, quality check, and cleaning</w:t>
+              <w:t xml:space="preserve">preparation process myself from start to </w:t>
+            </w:r>
+            <w:proofErr w:type="gramStart"/>
+            <w:r>
+              <w:t>finish:</w:t>
+            </w:r>
+            <w:proofErr w:type="gramEnd"/>
+            <w:r>
+              <w:t xml:space="preserve"> download, quality check, and cleaning</w:t>
             </w:r>
           </w:p>
         </w:tc>
@@ -4556,6 +5231,7 @@
           </w:tcPr>
           <w:p>
             <w:r>
+              <w:lastRenderedPageBreak/>
               <w:t>Oct 11, 2026</w:t>
             </w:r>
           </w:p>
@@ -4980,6 +5656,7 @@
           </w:tcPr>
           <w:p>
             <w:r>
+              <w:lastRenderedPageBreak/>
               <w:t>Oct 16, 2026</w:t>
             </w:r>
           </w:p>
@@ -5070,7 +5747,15 @@
           </w:tcPr>
           <w:p>
             <w:r>
-              <w:t>Built the Add Incident feature end to end: form with checks, safe database queries, each record stored with who added it and when, shown in the app</w:t>
+              <w:t xml:space="preserve">Built the Add Incident feature end to </w:t>
+            </w:r>
+            <w:proofErr w:type="gramStart"/>
+            <w:r>
+              <w:t>end:</w:t>
+            </w:r>
+            <w:proofErr w:type="gramEnd"/>
+            <w:r>
+              <w:t xml:space="preserve"> form with checks, safe database queries, each record stored with who added it and when, shown in the app</w:t>
             </w:r>
           </w:p>
         </w:tc>
@@ -5139,8 +5824,13 @@
             <w:tcW w:w="2880" w:type="dxa"/>
           </w:tcPr>
           <w:p>
-            <w:r>
-              <w:t>Combined my work with Shashank's overlapping changes (login lockout and the Audit Log page) and updated the Security page statuses</w:t>
+            <w:proofErr w:type="gramStart"/>
+            <w:r>
+              <w:t>Combined</w:t>
+            </w:r>
+            <w:proofErr w:type="gramEnd"/>
+            <w:r>
+              <w:t xml:space="preserve"> my work with Shashank's overlapping changes (login lockout and the Audit Log page) and updated the Security page statuses</w:t>
             </w:r>
           </w:p>
         </w:tc>
@@ -5245,7 +5935,23 @@
           </w:tcPr>
           <w:p>
             <w:r>
-              <w:t>Redesigned the map page for everyday users: a simple how-to guide, big-picture numbers, automatic neighbourhood summaries, and a full details table</w:t>
+              <w:t xml:space="preserve">Redesigned the map page for everyday users: a simple how-to guide, big-picture numbers, automatic </w:t>
+            </w:r>
+            <w:proofErr w:type="spellStart"/>
+            <w:r>
+              <w:t>neighbourhood</w:t>
+            </w:r>
+            <w:proofErr w:type="spellEnd"/>
+            <w:r>
+              <w:t xml:space="preserve"> summaries, and </w:t>
+            </w:r>
+            <w:proofErr w:type="gramStart"/>
+            <w:r>
+              <w:t>a full details</w:t>
+            </w:r>
+            <w:proofErr w:type="gramEnd"/>
+            <w:r>
+              <w:t xml:space="preserve"> table</w:t>
             </w:r>
           </w:p>
         </w:tc>
@@ -5299,6 +6005,7 @@
           </w:tcPr>
           <w:p>
             <w:r>
+              <w:lastRenderedPageBreak/>
               <w:t>Oct 22, 2026</w:t>
             </w:r>
           </w:p>
@@ -5389,7 +6096,23 @@
           </w:tcPr>
           <w:p>
             <w:r>
-              <w:t>Started planning the neighbourhood map feature: neighbourhood-level summaries instead of exact points to protect privacy</w:t>
+              <w:t xml:space="preserve">Started planning the </w:t>
+            </w:r>
+            <w:proofErr w:type="spellStart"/>
+            <w:r>
+              <w:t>neighbourhood</w:t>
+            </w:r>
+            <w:proofErr w:type="spellEnd"/>
+            <w:r>
+              <w:t xml:space="preserve"> map feature: </w:t>
+            </w:r>
+            <w:proofErr w:type="spellStart"/>
+            <w:r>
+              <w:t>neighbourhood</w:t>
+            </w:r>
+            <w:proofErr w:type="spellEnd"/>
+            <w:r>
+              <w:t>-level summaries instead of exact points to protect privacy</w:t>
             </w:r>
           </w:p>
         </w:tc>
@@ -5634,8 +6357,29 @@
           </w:tcPr>
           <w:p>
             <w:r>
-              <w:t>Wrote the neighbourhood grouping step: counts and a middle-point location for each neighbourhood</w:t>
-            </w:r>
+              <w:t xml:space="preserve">Wrote the </w:t>
+            </w:r>
+            <w:proofErr w:type="spellStart"/>
+            <w:r>
+              <w:t>neighbourhood</w:t>
+            </w:r>
+            <w:proofErr w:type="spellEnd"/>
+            <w:r>
+              <w:t xml:space="preserve"> grouping </w:t>
+            </w:r>
+            <w:proofErr w:type="gramStart"/>
+            <w:r>
+              <w:t>step:</w:t>
+            </w:r>
+            <w:proofErr w:type="gramEnd"/>
+            <w:r>
+              <w:t xml:space="preserve"> counts and a middle-point location for each </w:t>
+            </w:r>
+            <w:proofErr w:type="spellStart"/>
+            <w:r>
+              <w:t>neighbourhood</w:t>
+            </w:r>
+            <w:proofErr w:type="spellEnd"/>
           </w:p>
         </w:tc>
       </w:tr>
@@ -5669,8 +6413,21 @@
           </w:tcPr>
           <w:p>
             <w:r>
-              <w:t>Added the grouping step: automatically put neighbourhoods with similar crime mixes together</w:t>
-            </w:r>
+              <w:t xml:space="preserve">Added the grouping step: automatically put </w:t>
+            </w:r>
+            <w:proofErr w:type="spellStart"/>
+            <w:r>
+              <w:t>neighbourhoods</w:t>
+            </w:r>
+            <w:proofErr w:type="spellEnd"/>
+            <w:r>
+              <w:t xml:space="preserve"> with similar crime </w:t>
+            </w:r>
+            <w:proofErr w:type="gramStart"/>
+            <w:r>
+              <w:t>mixes together</w:t>
+            </w:r>
+            <w:proofErr w:type="gramEnd"/>
           </w:p>
         </w:tc>
       </w:tr>
@@ -5740,7 +6497,15 @@
           </w:tcPr>
           <w:p>
             <w:r>
-              <w:t>Wrote tests for the map math and grouping, and fixed a bug where neighbourhoods with missing names crashed the page (61 tests passing)</w:t>
+              <w:t xml:space="preserve">Wrote tests for the map math and grouping, and fixed a bug where </w:t>
+            </w:r>
+            <w:proofErr w:type="spellStart"/>
+            <w:r>
+              <w:t>neighbourhoods</w:t>
+            </w:r>
+            <w:proofErr w:type="spellEnd"/>
+            <w:r>
+              <w:t xml:space="preserve"> with missing names crashed the page (61 tests passing)</w:t>
             </w:r>
           </w:p>
         </w:tc>
@@ -5805,7 +6570,31 @@
     </w:p>
     <w:p>
       <w:r>
-        <w:t>We thank our instructor, Padmapriya Arasanipalai Kandhadai, for the guidance on the project structure and for the feedback during the weekly check-ins. We also thank the Vancouver Police Department for publishing the crime data openly on GeoDASH.</w:t>
+        <w:t xml:space="preserve">We thank our instructor, Padmapriya </w:t>
+      </w:r>
+      <w:proofErr w:type="spellStart"/>
+      <w:r>
+        <w:t>Arasanipalai</w:t>
+      </w:r>
+      <w:proofErr w:type="spellEnd"/>
+      <w:r>
+        <w:t xml:space="preserve"> </w:t>
+      </w:r>
+      <w:proofErr w:type="spellStart"/>
+      <w:r>
+        <w:t>Kandhadai</w:t>
+      </w:r>
+      <w:proofErr w:type="spellEnd"/>
+      <w:r>
+        <w:t xml:space="preserve">, for the guidance on the project structure and for the feedback during the weekly check-ins. We also thank the Vancouver Police Department for publishing the crime data openly on </w:t>
+      </w:r>
+      <w:proofErr w:type="spellStart"/>
+      <w:r>
+        <w:t>GeoDASH</w:t>
+      </w:r>
+      <w:proofErr w:type="spellEnd"/>
+      <w:r>
+        <w:t>.</w:t>
       </w:r>
     </w:p>
     <w:p>
@@ -5818,12 +6607,28 @@
     </w:p>
     <w:p>
       <w:r>
-        <w:t>[1] Vancouver Police Department. GeoDASH Open Data - Crime Incidents. https://geodash.vpd.ca/ (dataset downloaded Oct 2026).</w:t>
+        <w:t xml:space="preserve">[1] Vancouver Police Department. </w:t>
+      </w:r>
+      <w:proofErr w:type="spellStart"/>
+      <w:r>
+        <w:t>GeoDASH</w:t>
+      </w:r>
+      <w:proofErr w:type="spellEnd"/>
+      <w:r>
+        <w:t xml:space="preserve"> Open Data - Crime Incidents. https://geodash.vpd.ca/ (dataset downloaded Oct 2026).</w:t>
       </w:r>
     </w:p>
     <w:p>
       <w:r>
-        <w:t>[2] Vancouver Police Department. VPD OpenData Crime Incidents Description (PDF, included with the dataset download).</w:t>
+        <w:t xml:space="preserve">[2] Vancouver Police Department. VPD </w:t>
+      </w:r>
+      <w:proofErr w:type="spellStart"/>
+      <w:r>
+        <w:t>OpenData</w:t>
+      </w:r>
+      <w:proofErr w:type="spellEnd"/>
+      <w:r>
+        <w:t xml:space="preserve"> Crime Incidents Description (PDF, included with the dataset download).</w:t>
       </w:r>
     </w:p>
     <w:p>
@@ -5833,7 +6638,15 @@
     </w:p>
     <w:p>
       <w:r>
-        <w:t>[4] Microsoft. STRIDE threat modeling (Shostack, L.). Microsoft Security Documentation.</w:t>
+        <w:t>[4] Microsoft. STRIDE threat modeling (</w:t>
+      </w:r>
+      <w:proofErr w:type="spellStart"/>
+      <w:r>
+        <w:t>Shostack</w:t>
+      </w:r>
+      <w:proofErr w:type="spellEnd"/>
+      <w:r>
+        <w:t>, L.). Microsoft Security Documentation.</w:t>
       </w:r>
     </w:p>
     <w:p>
@@ -5843,7 +6656,15 @@
     </w:p>
     <w:p>
       <w:r>
-        <w:t>[6] Streamlit Documentation. https://docs.streamlit.io/</w:t>
+        <w:t xml:space="preserve">[6] </w:t>
+      </w:r>
+      <w:proofErr w:type="spellStart"/>
+      <w:r>
+        <w:t>Streamlit</w:t>
+      </w:r>
+      <w:proofErr w:type="spellEnd"/>
+      <w:r>
+        <w:t xml:space="preserve"> Documentation. https://docs.streamlit.io/</w:t>
       </w:r>
     </w:p>
     <w:p>
@@ -5861,7 +6682,21 @@
         <w:rPr>
           <w:lang w:val="fr-FR"/>
         </w:rPr>
-        <w:t>[8] Folium Documentation. https://python-visualization.github.io/folium/</w:t>
+        <w:t xml:space="preserve">[8] </w:t>
+      </w:r>
+      <w:proofErr w:type="spellStart"/>
+      <w:r>
+        <w:rPr>
+          <w:lang w:val="fr-FR"/>
+        </w:rPr>
+        <w:t>Folium</w:t>
+      </w:r>
+      <w:proofErr w:type="spellEnd"/>
+      <w:r>
+        <w:rPr>
+          <w:lang w:val="fr-FR"/>
+        </w:rPr>
+        <w:t xml:space="preserve"> Documentation. https://python-visualization.github.io/folium/</w:t>
       </w:r>
     </w:p>
     <w:p>
@@ -5874,7 +6709,35 @@
         <w:rPr>
           <w:lang w:val="fr-FR"/>
         </w:rPr>
-        <w:t>[9] SciPy Documentation. scipy.stats.chi2_contingency. https://docs.scipy.org/</w:t>
+        <w:t xml:space="preserve">[9] </w:t>
+      </w:r>
+      <w:proofErr w:type="spellStart"/>
+      <w:r>
+        <w:rPr>
+          <w:lang w:val="fr-FR"/>
+        </w:rPr>
+        <w:t>SciPy</w:t>
+      </w:r>
+      <w:proofErr w:type="spellEnd"/>
+      <w:r>
+        <w:rPr>
+          <w:lang w:val="fr-FR"/>
+        </w:rPr>
+        <w:t xml:space="preserve"> Documentation. </w:t>
+      </w:r>
+      <w:proofErr w:type="gramStart"/>
+      <w:r>
+        <w:rPr>
+          <w:lang w:val="fr-FR"/>
+        </w:rPr>
+        <w:t>scipy.stats</w:t>
+      </w:r>
+      <w:proofErr w:type="gramEnd"/>
+      <w:r>
+        <w:rPr>
+          <w:lang w:val="fr-FR"/>
+        </w:rPr>
+        <w:t>.chi2_contingency. https://docs.scipy.org/</w:t>
       </w:r>
     </w:p>
     <w:p>
@@ -5890,134 +6753,6 @@
         <w:br w:type="page"/>
       </w:r>
     </w:p>
-    <w:p>
-      <w:pPr>
-        <w:pStyle w:val="Heading1"/>
-      </w:pPr>
-      <w:r>
-        <w:lastRenderedPageBreak/>
-        <w:t>Grading Rubric (from the template)</w:t>
-      </w:r>
-    </w:p>
-    <w:tbl>
-      <w:tblPr>
-        <w:tblStyle w:val="TableGrid"/>
-        <w:tblW w:w="0" w:type="auto"/>
-        <w:jc w:val="center"/>
-        <w:tblLook w:val="04A0" w:firstRow="1" w:lastRow="0" w:firstColumn="1" w:lastColumn="0" w:noHBand="0" w:noVBand="1"/>
-      </w:tblPr>
-      <w:tblGrid>
-        <w:gridCol w:w="4320"/>
-        <w:gridCol w:w="4320"/>
-      </w:tblGrid>
-      <w:tr>
-        <w:trPr>
-          <w:jc w:val="center"/>
-        </w:trPr>
-        <w:tc>
-          <w:tcPr>
-            <w:tcW w:w="4320" w:type="dxa"/>
-          </w:tcPr>
-          <w:p>
-            <w:r>
-              <w:rPr>
-                <w:b/>
-              </w:rPr>
-              <w:t>Criteria</w:t>
-            </w:r>
-          </w:p>
-        </w:tc>
-        <w:tc>
-          <w:tcPr>
-            <w:tcW w:w="4320" w:type="dxa"/>
-          </w:tcPr>
-          <w:p>
-            <w:r>
-              <w:rPr>
-                <w:b/>
-              </w:rPr>
-              <w:t>Grading</w:t>
-            </w:r>
-          </w:p>
-        </w:tc>
-      </w:tr>
-      <w:tr>
-        <w:trPr>
-          <w:jc w:val="center"/>
-        </w:trPr>
-        <w:tc>
-          <w:tcPr>
-            <w:tcW w:w="4320" w:type="dxa"/>
-          </w:tcPr>
-          <w:p>
-            <w:r>
-              <w:t>Report Adherence - Completed CHECKLIST given in Pg. 1; addresses all sections with clarity and details; changes to the original proposal clearly outlined with revised timelines and scope; each student's contribution clear in implementation details and work logs; good English and composition; verbal and visual information as appropriate</w:t>
-            </w:r>
-          </w:p>
-        </w:tc>
-        <w:tc>
-          <w:tcPr>
-            <w:tcW w:w="4320" w:type="dxa"/>
-          </w:tcPr>
-          <w:p>
-            <w:r>
-              <w:t>4 points</w:t>
-            </w:r>
-          </w:p>
-        </w:tc>
-      </w:tr>
-      <w:tr>
-        <w:trPr>
-          <w:jc w:val="center"/>
-        </w:trPr>
-        <w:tc>
-          <w:tcPr>
-            <w:tcW w:w="4320" w:type="dxa"/>
-          </w:tcPr>
-          <w:p>
-            <w:r>
-              <w:t>Video Recording - clickable public link on the title page; single composite video of the product features; each student's contribution clearly demonstrated</w:t>
-            </w:r>
-          </w:p>
-        </w:tc>
-        <w:tc>
-          <w:tcPr>
-            <w:tcW w:w="4320" w:type="dxa"/>
-          </w:tcPr>
-          <w:p>
-            <w:r>
-              <w:t>4 points</w:t>
-            </w:r>
-          </w:p>
-        </w:tc>
-      </w:tr>
-      <w:tr>
-        <w:trPr>
-          <w:jc w:val="center"/>
-        </w:trPr>
-        <w:tc>
-          <w:tcPr>
-            <w:tcW w:w="4320" w:type="dxa"/>
-          </w:tcPr>
-          <w:p>
-            <w:r>
-              <w:t>GitHub Repository CODE and installation instructions Check-In - evaluated individually for EACH STUDENT; README installation instructions updated; consistency of code check-in, complexity of code, technical merit of features</w:t>
-            </w:r>
-          </w:p>
-        </w:tc>
-        <w:tc>
-          <w:tcPr>
-            <w:tcW w:w="4320" w:type="dxa"/>
-          </w:tcPr>
-          <w:p>
-            <w:r>
-              <w:t>7 points</w:t>
-            </w:r>
-          </w:p>
-        </w:tc>
-      </w:tr>
-    </w:tbl>
-    <w:p/>
     <w:sectPr>
       <w:pgSz w:w="12240" w:h="15840"/>
       <w:pgMar w:top="1440" w:right="1800" w:bottom="1440" w:left="1800" w:header="720" w:footer="720" w:gutter="0"/>
@@ -6837,7 +7572,6 @@
   <w:style w:type="character" w:default="1" w:styleId="DefaultParagraphFont">
     <w:name w:val="Default Paragraph Font"/>
     <w:uiPriority w:val="1"/>
-    <w:semiHidden/>
     <w:unhideWhenUsed/>
   </w:style>
   <w:style w:type="table" w:default="1" w:styleId="TableNormal">
@@ -17614,6 +18348,41 @@
       </w:tcPr>
     </w:tblStylePr>
   </w:style>
+  <w:style w:type="character" w:styleId="Hyperlink">
+    <w:name w:val="Hyperlink"/>
+    <w:basedOn w:val="DefaultParagraphFont"/>
+    <w:uiPriority w:val="99"/>
+    <w:unhideWhenUsed/>
+    <w:rsid w:val="002A078D"/>
+    <w:rPr>
+      <w:color w:val="0000FF" w:themeColor="hyperlink"/>
+      <w:u w:val="single"/>
+    </w:rPr>
+  </w:style>
+  <w:style w:type="character" w:styleId="UnresolvedMention">
+    <w:name w:val="Unresolved Mention"/>
+    <w:basedOn w:val="DefaultParagraphFont"/>
+    <w:uiPriority w:val="99"/>
+    <w:semiHidden/>
+    <w:unhideWhenUsed/>
+    <w:rsid w:val="002A078D"/>
+    <w:rPr>
+      <w:color w:val="605E5C"/>
+      <w:shd w:val="clear" w:color="auto" w:fill="E1DFDD"/>
+    </w:rPr>
+  </w:style>
+  <w:style w:type="character" w:styleId="FollowedHyperlink">
+    <w:name w:val="FollowedHyperlink"/>
+    <w:basedOn w:val="DefaultParagraphFont"/>
+    <w:uiPriority w:val="99"/>
+    <w:semiHidden/>
+    <w:unhideWhenUsed/>
+    <w:rsid w:val="00101862"/>
+    <w:rPr>
+      <w:color w:val="800080" w:themeColor="followedHyperlink"/>
+      <w:u w:val="single"/>
+    </w:rPr>
+  </w:style>
 </w:styles>
 </file>
 

</xml_diff>